<commit_message>
feat(v1): deterministic LLM options + native-RTOS truth-sync across README/report/deck
</commit_message>
<xml_diff>
--- a/docs/report/report.docx
+++ b/docs/report/report.docx
@@ -2,7 +2,7 @@
 <file path=word/document.xml><?xml version="1.0" encoding="utf-8"?>
 <w:document xmlns:w="http://schemas.openxmlformats.org/wordprocessingml/2006/main" xmlns:m="http://schemas.openxmlformats.org/officeDocument/2006/math" xmlns:r="http://schemas.openxmlformats.org/officeDocument/2006/relationships" xmlns:o="urn:schemas-microsoft-com:office:office" xmlns:v="urn:schemas-microsoft-com:vml" xmlns:w10="urn:schemas-microsoft-com:office:word" xmlns:a="http://schemas.openxmlformats.org/drawingml/2006/main" xmlns:pic="http://schemas.openxmlformats.org/drawingml/2006/picture" xmlns:wp="http://schemas.openxmlformats.org/drawingml/2006/wordprocessingDrawing">
   <w:body>
-    <w:bookmarkStart w:id="48" w:name="X65af0e17dfabdaed65f0d2c60fd7ea8e1f10891"/>
+    <w:bookmarkStart w:id="49" w:name="X65af0e17dfabdaed65f0d2c60fd7ea8e1f10891"/>
     <w:p>
       <w:pPr>
         <w:pStyle w:val="Heading1"/>
@@ -3291,7 +3291,7 @@
     </w:p>
     <w:bookmarkEnd w:id="32"/>
     <w:bookmarkEnd w:id="33"/>
-    <w:bookmarkStart w:id="37" w:name="hardware-design-bill-of-materials"/>
+    <w:bookmarkStart w:id="38" w:name="hardware-design-bill-of-materials"/>
     <w:p>
       <w:pPr>
         <w:pStyle w:val="Heading2"/>
@@ -4242,6 +4242,63 @@
         <w:t xml:space="preserve">service 0x180D; park it if bonded/encrypted, as expected).</w:t>
       </w:r>
     </w:p>
+    <w:bookmarkEnd w:id="36"/>
+    <w:bookmarkStart w:id="37" w:name="native-rtos-simulation"/>
+    <w:p>
+      <w:pPr>
+        <w:pStyle w:val="Heading3"/>
+      </w:pPr>
+      <w:r>
+        <w:t xml:space="preserve">7.4 Native RTOS simulation</w:t>
+      </w:r>
+    </w:p>
+    <w:p>
+      <w:pPr>
+        <w:pStyle w:val="FirstParagraph"/>
+      </w:pPr>
+      <w:r>
+        <w:t xml:space="preserve">Alongside the Wokwi browser sim, a native device node (</w:t>
+      </w:r>
+      <w:r>
+        <w:rPr>
+          <w:rStyle w:val="VerbatimChar"/>
+        </w:rPr>
+        <w:t xml:space="preserve">hardware/native/</w:t>
+      </w:r>
+      <w:r>
+        <w:t xml:space="preserve">)</w:t>
+      </w:r>
+      <w:r>
+        <w:t xml:space="preserve"> </w:t>
+      </w:r>
+      <w:r>
+        <w:t xml:space="preserve">runs the real FreeRTOS v11 kernel on the Windows simulator port —</w:t>
+      </w:r>
+      <w:r>
+        <w:t xml:space="preserve"> </w:t>
+      </w:r>
+      <w:r>
+        <w:t xml:space="preserve">keyboard-driven (1/2/3/b/0), printing RTOS status plus 1 Hz JSON telemetry</w:t>
+      </w:r>
+      <w:r>
+        <w:t xml:space="preserve"> </w:t>
+      </w:r>
+      <w:r>
+        <w:t xml:space="preserve">that pipes straight into the dashboard. Timing is best-effort (Windows is</w:t>
+      </w:r>
+      <w:r>
+        <w:t xml:space="preserve"> </w:t>
+      </w:r>
+      <w:r>
+        <w:t xml:space="preserve">not hard-RT), but kernel semantics are genuine; it stands in for the</w:t>
+      </w:r>
+      <w:r>
+        <w:t xml:space="preserve"> </w:t>
+      </w:r>
+      <w:r>
+        <w:t xml:space="preserve">wristboard until parts arrive.</w:t>
+      </w:r>
+    </w:p>
     <w:p>
       <w:r>
         <w:pict>
@@ -4249,9 +4306,9 @@
         </w:pict>
       </w:r>
     </w:p>
-    <w:bookmarkEnd w:id="36"/>
     <w:bookmarkEnd w:id="37"/>
-    <w:bookmarkStart w:id="43" w:name="testing-results"/>
+    <w:bookmarkEnd w:id="38"/>
+    <w:bookmarkStart w:id="44" w:name="testing-results"/>
     <w:p>
       <w:pPr>
         <w:pStyle w:val="Heading2"/>
@@ -4286,7 +4343,7 @@
         <w:t xml:space="preserve">.</w:t>
       </w:r>
     </w:p>
-    <w:bookmarkStart w:id="38" w:name="Xee30008471395568b7338080b9c122573407f30"/>
+    <w:bookmarkStart w:id="39" w:name="Xee30008471395568b7338080b9c122573407f30"/>
     <w:p>
       <w:pPr>
         <w:pStyle w:val="Heading3"/>
@@ -4362,8 +4419,8 @@
         <w:t xml:space="preserve">Result: received=75, dropped=0 over 15.00 s; session CSV written.</w:t>
       </w:r>
     </w:p>
-    <w:bookmarkEnd w:id="38"/>
-    <w:bookmarkStart w:id="39" w:name="Xd7320d9fa3a2169a9f5edbdfe24e29f7afe1205"/>
+    <w:bookmarkEnd w:id="39"/>
+    <w:bookmarkStart w:id="40" w:name="Xd7320d9fa3a2169a9f5edbdfe24e29f7afe1205"/>
     <w:p>
       <w:pPr>
         <w:pStyle w:val="Heading3"/>
@@ -4537,8 +4594,8 @@
         <w:t xml:space="preserve">fallback — together they prove the Ollama → API → template chain.</w:t>
       </w:r>
     </w:p>
-    <w:bookmarkEnd w:id="39"/>
-    <w:bookmarkStart w:id="40" w:name="X0afc81a12deb11275aef45a20d1e16051e740b7"/>
+    <w:bookmarkEnd w:id="40"/>
+    <w:bookmarkStart w:id="41" w:name="X0afc81a12deb11275aef45a20d1e16051e740b7"/>
     <w:p>
       <w:pPr>
         <w:pStyle w:val="Heading3"/>
@@ -4631,8 +4688,8 @@
         <w:t xml:space="preserve">(no radio in range at test time).</w:t>
       </w:r>
     </w:p>
-    <w:bookmarkEnd w:id="40"/>
-    <w:bookmarkStart w:id="41" w:name="X67f8d25e6c5695d95bd30f00e899c6e82b2d076"/>
+    <w:bookmarkEnd w:id="41"/>
+    <w:bookmarkStart w:id="42" w:name="X67f8d25e6c5695d95bd30f00e899c6e82b2d076"/>
     <w:p>
       <w:pPr>
         <w:pStyle w:val="Heading3"/>
@@ -4777,8 +4834,8 @@
         <w:t xml:space="preserve">Live-mic input on stage hardware remains the untested remainder (§9.3).</w:t>
       </w:r>
     </w:p>
-    <w:bookmarkEnd w:id="41"/>
-    <w:bookmarkStart w:id="42" w:name="sample-session-data"/>
+    <w:bookmarkEnd w:id="42"/>
+    <w:bookmarkStart w:id="43" w:name="sample-session-data"/>
     <w:p>
       <w:pPr>
         <w:pStyle w:val="Heading3"/>
@@ -5510,9 +5567,9 @@
         </w:pict>
       </w:r>
     </w:p>
-    <w:bookmarkEnd w:id="42"/>
     <w:bookmarkEnd w:id="43"/>
-    <w:bookmarkStart w:id="44" w:name="limitations-risk-mitigation"/>
+    <w:bookmarkEnd w:id="44"/>
+    <w:bookmarkStart w:id="45" w:name="limitations-risk-mitigation"/>
     <w:p>
       <w:pPr>
         <w:pStyle w:val="Heading2"/>
@@ -5959,8 +6016,8 @@
         </w:pict>
       </w:r>
     </w:p>
-    <w:bookmarkEnd w:id="44"/>
-    <w:bookmarkStart w:id="45" w:name="timeline-next-steps"/>
+    <w:bookmarkEnd w:id="45"/>
+    <w:bookmarkStart w:id="46" w:name="timeline-next-steps"/>
     <w:p>
       <w:pPr>
         <w:pStyle w:val="Heading2"/>
@@ -6495,8 +6552,8 @@
         </w:pict>
       </w:r>
     </w:p>
-    <w:bookmarkEnd w:id="45"/>
-    <w:bookmarkStart w:id="46" w:name="conclusion"/>
+    <w:bookmarkEnd w:id="46"/>
+    <w:bookmarkStart w:id="47" w:name="conclusion"/>
     <w:p>
       <w:pPr>
         <w:pStyle w:val="Heading2"/>
@@ -6598,8 +6655,8 @@
         </w:pict>
       </w:r>
     </w:p>
-    <w:bookmarkEnd w:id="46"/>
-    <w:bookmarkStart w:id="47" w:name="references"/>
+    <w:bookmarkEnd w:id="47"/>
+    <w:bookmarkStart w:id="48" w:name="references"/>
     <w:p>
       <w:pPr>
         <w:pStyle w:val="Heading2"/>
@@ -7164,8 +7221,8 @@
         <w:t xml:space="preserve">) is superseded by §1.</w:t>
       </w:r>
     </w:p>
-    <w:bookmarkEnd w:id="47"/>
     <w:bookmarkEnd w:id="48"/>
+    <w:bookmarkEnd w:id="49"/>
     <w:sectPr>
       <w:footnotePr>
         <w:numRestart w:val="eachSect"/>

</xml_diff>